<commit_message>
Add Ziyadinkhan Kudaibergenuly and SE2501 to assignment documents
</commit_message>
<xml_diff>
--- a/docs/PREPARATION_GUIDE.docx
+++ b/docs/PREPARATION_GUIDE.docx
@@ -1266,7 +1266,7 @@
           <w:sz w:val="22"/>
           <w:szCs w:val="22"/>
         </w:rPr>
-        <w:t>- Fill in your name and group, review the report, and follow the institution's disclosure rules.</w:t>
+        <w:t>- Check your name and group, review the report, and follow the institution's disclosure rules.</w:t>
       </w:r>
     </w:p>
     <w:p>
@@ -2041,7 +2041,7 @@
     <w:link w:val="a5"/>
     <w:uiPriority w:val="99"/>
     <w:unhideWhenUsed/>
-    <w:rsid w:val="00B47A4D"/>
+    <w:rsid w:val="00BC0EEC"/>
     <w:pPr>
       <w:tabs>
         <w:tab w:val="center" w:pos="4677"/>
@@ -2054,7 +2054,7 @@
     <w:basedOn w:val="a0"/>
     <w:link w:val="a4"/>
     <w:uiPriority w:val="99"/>
-    <w:rsid w:val="00B47A4D"/>
+    <w:rsid w:val="00BC0EEC"/>
     <w:rPr>
       <w:rFonts w:eastAsiaTheme="minorEastAsia"/>
       <w:sz w:val="24"/>
@@ -2067,7 +2067,7 @@
     <w:link w:val="a7"/>
     <w:uiPriority w:val="99"/>
     <w:unhideWhenUsed/>
-    <w:rsid w:val="00B47A4D"/>
+    <w:rsid w:val="00BC0EEC"/>
     <w:pPr>
       <w:tabs>
         <w:tab w:val="center" w:pos="4677"/>
@@ -2080,7 +2080,7 @@
     <w:basedOn w:val="a0"/>
     <w:link w:val="a6"/>
     <w:uiPriority w:val="99"/>
-    <w:rsid w:val="00B47A4D"/>
+    <w:rsid w:val="00BC0EEC"/>
     <w:rPr>
       <w:rFonts w:eastAsiaTheme="minorEastAsia"/>
       <w:sz w:val="24"/>

</xml_diff>